<commit_message>
UML digram changed, code documented & reserach was extended
</commit_message>
<xml_diff>
--- a/Individual project/LO-02/Designing/Design document.docx
+++ b/Individual project/LO-02/Designing/Design document.docx
@@ -215,7 +215,7 @@
           <w:sz w:val="26"/>
           <w:szCs w:val="26"/>
         </w:rPr>
-        <w:t>2026-03-25</w:t>
+        <w:t>2026-04-16</w:t>
       </w:r>
       <w:r>
         <w:rPr>
@@ -1211,8 +1211,226 @@
     </w:p>
     <w:p>
       <w:pPr>
-        <w:ind w:left="720" w:right="-23"/>
-      </w:pPr>
+        <w:ind w:right="-23"/>
+      </w:pPr>
+    </w:p>
+    <w:p>
+      <w:pPr>
+        <w:ind w:left="426" w:right="-23"/>
+        <w:rPr>
+          <w:u w:val="single"/>
+        </w:rPr>
+      </w:pPr>
+    </w:p>
+    <w:p>
+      <w:pPr>
+        <w:ind w:left="426" w:right="-23"/>
+        <w:rPr>
+          <w:u w:val="single"/>
+        </w:rPr>
+      </w:pPr>
+      <w:r>
+        <w:rPr>
+          <w:u w:val="single"/>
+        </w:rPr>
+        <w:t>Contacts page</w:t>
+      </w:r>
+      <w:r>
+        <w:rPr>
+          <w:u w:val="single"/>
+        </w:rPr>
+        <w:t>:</w:t>
+      </w:r>
+    </w:p>
+    <w:p>
+      <w:pPr>
+        <w:ind w:right="-23"/>
+      </w:pPr>
+      <w:r>
+        <w:rPr>
+          <w:noProof/>
+        </w:rPr>
+        <w:lastRenderedPageBreak/>
+        <mc:AlternateContent>
+          <mc:Choice Requires="wps">
+            <w:drawing>
+              <wp:anchor distT="0" distB="0" distL="114300" distR="114300" simplePos="0" relativeHeight="251664384" behindDoc="0" locked="0" layoutInCell="1" allowOverlap="1" wp14:anchorId="40FA6FBD" wp14:editId="3137EDC4">
+                <wp:simplePos x="0" y="0"/>
+                <wp:positionH relativeFrom="column">
+                  <wp:posOffset>-131445</wp:posOffset>
+                </wp:positionH>
+                <wp:positionV relativeFrom="paragraph">
+                  <wp:posOffset>7004050</wp:posOffset>
+                </wp:positionV>
+                <wp:extent cx="6286500" cy="635"/>
+                <wp:effectExtent l="0" t="0" r="0" b="0"/>
+                <wp:wrapTopAndBottom/>
+                <wp:docPr id="1113491316" name="Text Box 1"/>
+                <wp:cNvGraphicFramePr/>
+                <a:graphic xmlns:a="http://schemas.openxmlformats.org/drawingml/2006/main">
+                  <a:graphicData uri="http://schemas.microsoft.com/office/word/2010/wordprocessingShape">
+                    <wps:wsp>
+                      <wps:cNvSpPr txBox="1"/>
+                      <wps:spPr>
+                        <a:xfrm>
+                          <a:off x="0" y="0"/>
+                          <a:ext cx="6286500" cy="635"/>
+                        </a:xfrm>
+                        <a:prstGeom prst="rect">
+                          <a:avLst/>
+                        </a:prstGeom>
+                        <a:solidFill>
+                          <a:prstClr val="white"/>
+                        </a:solidFill>
+                        <a:ln>
+                          <a:noFill/>
+                        </a:ln>
+                      </wps:spPr>
+                      <wps:txbx>
+                        <w:txbxContent>
+                          <w:p>
+                            <w:pPr>
+                              <w:pStyle w:val="Caption"/>
+                              <w:jc w:val="center"/>
+                            </w:pPr>
+                            <w:r>
+                              <w:t xml:space="preserve">Figure </w:t>
+                            </w:r>
+                            <w:r>
+                              <w:fldChar w:fldCharType="begin"/>
+                            </w:r>
+                            <w:r>
+                              <w:instrText xml:space="preserve"> SEQ Figure \* ARABIC </w:instrText>
+                            </w:r>
+                            <w:r>
+                              <w:fldChar w:fldCharType="separate"/>
+                            </w:r>
+                            <w:r>
+                              <w:rPr>
+                                <w:noProof/>
+                              </w:rPr>
+                              <w:t>3</w:t>
+                            </w:r>
+                            <w:r>
+                              <w:fldChar w:fldCharType="end"/>
+                            </w:r>
+                            <w:r>
+                              <w:t>: Contacts page</w:t>
+                            </w:r>
+                          </w:p>
+                          <w:p/>
+                        </w:txbxContent>
+                      </wps:txbx>
+                      <wps:bodyPr rot="0" spcFirstLastPara="0" vertOverflow="overflow" horzOverflow="overflow" vert="horz" wrap="square" lIns="0" tIns="0" rIns="0" bIns="0" numCol="1" spcCol="0" rtlCol="0" fromWordArt="0" anchor="t" anchorCtr="0" forceAA="0" compatLnSpc="1">
+                        <a:prstTxWarp prst="textNoShape">
+                          <a:avLst/>
+                        </a:prstTxWarp>
+                        <a:spAutoFit/>
+                      </wps:bodyPr>
+                    </wps:wsp>
+                  </a:graphicData>
+                </a:graphic>
+              </wp:anchor>
+            </w:drawing>
+          </mc:Choice>
+          <mc:Fallback>
+            <w:pict>
+              <v:shape w14:anchorId="40FA6FBD" id="_x0000_s1027" type="#_x0000_t202" style="position:absolute;margin-left:-10.35pt;margin-top:551.5pt;width:495pt;height:.05pt;z-index:251664384;visibility:visible;mso-wrap-style:square;mso-wrap-distance-left:9pt;mso-wrap-distance-top:0;mso-wrap-distance-right:9pt;mso-wrap-distance-bottom:0;mso-position-horizontal:absolute;mso-position-horizontal-relative:text;mso-position-vertical:absolute;mso-position-vertical-relative:text;v-text-anchor:top" o:gfxdata="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" stroked="f">
+                <v:textbox style="mso-fit-shape-to-text:t" inset="0,0,0,0">
+                  <w:txbxContent>
+                    <w:p>
+                      <w:pPr>
+                        <w:pStyle w:val="Caption"/>
+                        <w:jc w:val="center"/>
+                      </w:pPr>
+                      <w:r>
+                        <w:t xml:space="preserve">Figure </w:t>
+                      </w:r>
+                      <w:r>
+                        <w:fldChar w:fldCharType="begin"/>
+                      </w:r>
+                      <w:r>
+                        <w:instrText xml:space="preserve"> SEQ Figure \* ARABIC </w:instrText>
+                      </w:r>
+                      <w:r>
+                        <w:fldChar w:fldCharType="separate"/>
+                      </w:r>
+                      <w:r>
+                        <w:rPr>
+                          <w:noProof/>
+                        </w:rPr>
+                        <w:t>3</w:t>
+                      </w:r>
+                      <w:r>
+                        <w:fldChar w:fldCharType="end"/>
+                      </w:r>
+                      <w:r>
+                        <w:t>: Contacts page</w:t>
+                      </w:r>
+                    </w:p>
+                    <w:p/>
+                  </w:txbxContent>
+                </v:textbox>
+                <w10:wrap type="topAndBottom"/>
+              </v:shape>
+            </w:pict>
+          </mc:Fallback>
+        </mc:AlternateContent>
+      </w:r>
+      <w:r>
+        <w:drawing>
+          <wp:anchor distT="0" distB="0" distL="114300" distR="114300" simplePos="0" relativeHeight="251662336" behindDoc="0" locked="0" layoutInCell="1" allowOverlap="1" wp14:anchorId="5CA53D30" wp14:editId="26BDA3C2">
+            <wp:simplePos x="0" y="0"/>
+            <wp:positionH relativeFrom="column">
+              <wp:posOffset>-131907</wp:posOffset>
+            </wp:positionH>
+            <wp:positionV relativeFrom="paragraph">
+              <wp:posOffset>288</wp:posOffset>
+            </wp:positionV>
+            <wp:extent cx="6286500" cy="6946900"/>
+            <wp:effectExtent l="0" t="0" r="0" b="6350"/>
+            <wp:wrapTopAndBottom/>
+            <wp:docPr id="1551945667" name="Picture 1"/>
+            <wp:cNvGraphicFramePr>
+              <a:graphicFrameLocks xmlns:a="http://schemas.openxmlformats.org/drawingml/2006/main" noChangeAspect="1"/>
+            </wp:cNvGraphicFramePr>
+            <a:graphic xmlns:a="http://schemas.openxmlformats.org/drawingml/2006/main">
+              <a:graphicData uri="http://schemas.openxmlformats.org/drawingml/2006/picture">
+                <pic:pic xmlns:pic="http://schemas.openxmlformats.org/drawingml/2006/picture">
+                  <pic:nvPicPr>
+                    <pic:cNvPr id="1551945667" name=""/>
+                    <pic:cNvPicPr/>
+                  </pic:nvPicPr>
+                  <pic:blipFill>
+                    <a:blip r:embed="rId10">
+                      <a:extLst>
+                        <a:ext uri="{28A0092B-C50C-407E-A947-70E740481C1C}">
+                          <a14:useLocalDpi xmlns:a14="http://schemas.microsoft.com/office/drawing/2010/main" val="0"/>
+                        </a:ext>
+                      </a:extLst>
+                    </a:blip>
+                    <a:stretch>
+                      <a:fillRect/>
+                    </a:stretch>
+                  </pic:blipFill>
+                  <pic:spPr>
+                    <a:xfrm>
+                      <a:off x="0" y="0"/>
+                      <a:ext cx="6286500" cy="6946900"/>
+                    </a:xfrm>
+                    <a:prstGeom prst="rect">
+                      <a:avLst/>
+                    </a:prstGeom>
+                  </pic:spPr>
+                </pic:pic>
+              </a:graphicData>
+            </a:graphic>
+          </wp:anchor>
+        </w:drawing>
+      </w:r>
+      <w:r>
+        <w:t>In this page the user could see contact details like office, phone number, email and there is a contact form where users could send their inquiries.</w:t>
+      </w:r>
     </w:p>
     <w:p>
       <w:pPr>
@@ -1235,6 +1453,7 @@
           <w:sz w:val="32"/>
           <w:szCs w:val="32"/>
         </w:rPr>
+        <w:lastRenderedPageBreak/>
         <w:t>Class diagram</w:t>
       </w:r>
     </w:p>
@@ -1248,7 +1467,6 @@
     </w:p>
     <w:p>
       <w:pPr>
-        <w:keepNext/>
         <w:ind w:right="-23"/>
       </w:pPr>
       <w:r>
@@ -1256,9 +1474,17 @@
           <w:noProof/>
         </w:rPr>
         <w:drawing>
-          <wp:inline distT="0" distB="0" distL="0" distR="0" wp14:anchorId="3E5641CB" wp14:editId="77DBFE65">
-            <wp:extent cx="5943600" cy="2414270"/>
-            <wp:effectExtent l="0" t="0" r="0" b="5080"/>
+          <wp:anchor distT="0" distB="0" distL="114300" distR="114300" simplePos="0" relativeHeight="251665408" behindDoc="0" locked="0" layoutInCell="1" allowOverlap="1" wp14:anchorId="3E5641CB" wp14:editId="54788E66">
+            <wp:simplePos x="0" y="0"/>
+            <wp:positionH relativeFrom="column">
+              <wp:posOffset>457200</wp:posOffset>
+            </wp:positionH>
+            <wp:positionV relativeFrom="paragraph">
+              <wp:posOffset>146050</wp:posOffset>
+            </wp:positionV>
+            <wp:extent cx="5128260" cy="4406265"/>
+            <wp:effectExtent l="0" t="0" r="0" b="0"/>
+            <wp:wrapTopAndBottom/>
             <wp:docPr id="241476080" name="Picture 1"/>
             <wp:cNvGraphicFramePr>
               <a:graphicFrameLocks xmlns:a="http://schemas.openxmlformats.org/drawingml/2006/main" noChangeAspect="1"/>
@@ -1267,11 +1493,17 @@
               <a:graphicData uri="http://schemas.openxmlformats.org/drawingml/2006/picture">
                 <pic:pic xmlns:pic="http://schemas.openxmlformats.org/drawingml/2006/picture">
                   <pic:nvPicPr>
-                    <pic:cNvPr id="241476080" name=""/>
+                    <pic:cNvPr id="241476080" name="Picture 1"/>
                     <pic:cNvPicPr/>
                   </pic:nvPicPr>
                   <pic:blipFill>
-                    <a:blip r:embed="rId10"/>
+                    <a:blip r:embed="rId11">
+                      <a:extLst>
+                        <a:ext uri="{28A0092B-C50C-407E-A947-70E740481C1C}">
+                          <a14:useLocalDpi xmlns:a14="http://schemas.microsoft.com/office/drawing/2010/main" val="0"/>
+                        </a:ext>
+                      </a:extLst>
+                    </a:blip>
                     <a:stretch>
                       <a:fillRect/>
                     </a:stretch>
@@ -1279,7 +1511,7 @@
                   <pic:spPr>
                     <a:xfrm>
                       <a:off x="0" y="0"/>
-                      <a:ext cx="5943600" cy="2414270"/>
+                      <a:ext cx="5128260" cy="4406265"/>
                     </a:xfrm>
                     <a:prstGeom prst="rect">
                       <a:avLst/>
@@ -1288,9 +1520,21 @@
                 </pic:pic>
               </a:graphicData>
             </a:graphic>
-          </wp:inline>
+            <wp14:sizeRelH relativeFrom="margin">
+              <wp14:pctWidth>0</wp14:pctWidth>
+            </wp14:sizeRelH>
+            <wp14:sizeRelV relativeFrom="margin">
+              <wp14:pctHeight>0</wp14:pctHeight>
+            </wp14:sizeRelV>
+          </wp:anchor>
         </w:drawing>
       </w:r>
+    </w:p>
+    <w:p>
+      <w:pPr>
+        <w:keepNext/>
+        <w:ind w:right="-23"/>
+      </w:pPr>
     </w:p>
     <w:p>
       <w:pPr>
@@ -1314,7 +1558,7 @@
         <w:rPr>
           <w:noProof/>
         </w:rPr>
-        <w:t>3</w:t>
+        <w:t>4</w:t>
       </w:r>
       <w:r>
         <w:fldChar w:fldCharType="end"/>
@@ -1378,7 +1622,6 @@
           <w:sz w:val="32"/>
           <w:szCs w:val="32"/>
         </w:rPr>
-        <w:lastRenderedPageBreak/>
         <w:t>Tec</w:t>
       </w:r>
       <w:r>
@@ -1591,6 +1834,7 @@
           <w:sz w:val="20"/>
           <w:szCs w:val="20"/>
         </w:rPr>
+        <w:lastRenderedPageBreak/>
         <w:t>Business logic layer:</w:t>
       </w:r>
       <w:r>
@@ -1967,7 +2211,7 @@
                     <pic:cNvPicPr/>
                   </pic:nvPicPr>
                   <pic:blipFill>
-                    <a:blip r:embed="rId11" cstate="print">
+                    <a:blip r:embed="rId12" cstate="print">
                       <a:extLst>
                         <a:ext uri="{28A0092B-C50C-407E-A947-70E740481C1C}">
                           <a14:useLocalDpi xmlns:a14="http://schemas.microsoft.com/office/drawing/2010/main" val="0"/>
@@ -2026,7 +2270,6 @@
         <w:jc w:val="center"/>
       </w:pPr>
       <w:r>
-        <w:lastRenderedPageBreak/>
         <w:t xml:space="preserve">Figure </w:t>
       </w:r>
       <w:r>
@@ -2042,7 +2285,7 @@
         <w:rPr>
           <w:noProof/>
         </w:rPr>
-        <w:t>4</w:t>
+        <w:t>5</w:t>
       </w:r>
       <w:r>
         <w:fldChar w:fldCharType="end"/>
@@ -2217,6 +2460,7 @@
           <w:sz w:val="18"/>
           <w:szCs w:val="18"/>
         </w:rPr>
+        <w:lastRenderedPageBreak/>
         <w:t>User</w:t>
       </w:r>
       <w:r>
@@ -2781,7 +3025,6 @@
         <w:tblCellMar>
           <w:top w:w="169" w:type="dxa"/>
           <w:left w:w="118" w:type="dxa"/>
-          <w:bottom w:w="0" w:type="dxa"/>
           <w:right w:w="115" w:type="dxa"/>
         </w:tblCellMar>
         <w:tblLook w:val="04A0" w:firstRow="1" w:lastRow="0" w:firstColumn="1" w:lastColumn="0" w:noHBand="0" w:noVBand="1"/>
@@ -3138,10 +3381,7 @@
             </w:pPr>
             <w:proofErr w:type="spellStart"/>
             <w:r>
-              <w:t>N</w:t>
-            </w:r>
-            <w:r>
-              <w:t>varchar</w:t>
+              <w:t>Nvarchar</w:t>
             </w:r>
             <w:proofErr w:type="spellEnd"/>
           </w:p>
@@ -3309,7 +3549,6 @@
             </w:pPr>
             <w:proofErr w:type="spellStart"/>
             <w:r>
-              <w:lastRenderedPageBreak/>
               <w:t>PricePerDay</w:t>
             </w:r>
             <w:proofErr w:type="spellEnd"/>
@@ -3428,10 +3667,7 @@
             </w:pPr>
             <w:proofErr w:type="spellStart"/>
             <w:r>
-              <w:t>N</w:t>
-            </w:r>
-            <w:r>
-              <w:t>varchar</w:t>
+              <w:t>Nvarchar</w:t>
             </w:r>
             <w:proofErr w:type="spellEnd"/>
           </w:p>
@@ -3622,10 +3858,7 @@
             </w:pPr>
             <w:proofErr w:type="spellStart"/>
             <w:r>
-              <w:t>N</w:t>
-            </w:r>
-            <w:r>
-              <w:t>varchar</w:t>
+              <w:t>Nvarchar</w:t>
             </w:r>
             <w:proofErr w:type="spellEnd"/>
           </w:p>
@@ -3696,6 +3929,7 @@
             </w:pPr>
             <w:proofErr w:type="spellStart"/>
             <w:r>
+              <w:lastRenderedPageBreak/>
               <w:t>CarStatus</w:t>
             </w:r>
             <w:proofErr w:type="spellEnd"/>
@@ -3719,10 +3953,7 @@
             </w:pPr>
             <w:proofErr w:type="spellStart"/>
             <w:r>
-              <w:t>N</w:t>
-            </w:r>
-            <w:r>
-              <w:t>varchar</w:t>
+              <w:t>Nvarchar</w:t>
             </w:r>
             <w:proofErr w:type="spellEnd"/>
           </w:p>
@@ -3842,7 +4073,6 @@
         <w:tblCellMar>
           <w:top w:w="169" w:type="dxa"/>
           <w:left w:w="118" w:type="dxa"/>
-          <w:bottom w:w="0" w:type="dxa"/>
           <w:right w:w="115" w:type="dxa"/>
         </w:tblCellMar>
         <w:tblLook w:val="04A0" w:firstRow="1" w:lastRow="0" w:firstColumn="1" w:lastColumn="0" w:noHBand="0" w:noVBand="1"/>
@@ -4355,7 +4585,6 @@
         <w:tblCellMar>
           <w:top w:w="169" w:type="dxa"/>
           <w:left w:w="118" w:type="dxa"/>
-          <w:bottom w:w="0" w:type="dxa"/>
           <w:right w:w="115" w:type="dxa"/>
         </w:tblCellMar>
         <w:tblLook w:val="04A0" w:firstRow="1" w:lastRow="0" w:firstColumn="1" w:lastColumn="0" w:noHBand="0" w:noVBand="1"/>
@@ -4560,10 +4789,7 @@
               <w:ind w:left="2" w:right="-23"/>
             </w:pPr>
             <w:r>
-              <w:t xml:space="preserve">Unique identifier for each </w:t>
-            </w:r>
-            <w:r>
-              <w:t>image</w:t>
+              <w:t>Unique identifier for each image</w:t>
             </w:r>
           </w:p>
         </w:tc>
@@ -4611,10 +4837,7 @@
             </w:pPr>
             <w:proofErr w:type="spellStart"/>
             <w:r>
-              <w:t>N</w:t>
-            </w:r>
-            <w:r>
-              <w:t>varchar</w:t>
+              <w:t>Nvarchar</w:t>
             </w:r>
             <w:proofErr w:type="spellEnd"/>
           </w:p>
@@ -4904,7 +5127,6 @@
           <w:sz w:val="18"/>
           <w:szCs w:val="18"/>
         </w:rPr>
-        <w:lastRenderedPageBreak/>
         <w:t>‘</w:t>
       </w:r>
       <w:r>
@@ -4930,7 +5152,6 @@
         <w:tblCellMar>
           <w:top w:w="169" w:type="dxa"/>
           <w:left w:w="118" w:type="dxa"/>
-          <w:bottom w:w="0" w:type="dxa"/>
           <w:right w:w="115" w:type="dxa"/>
         </w:tblCellMar>
         <w:tblLook w:val="04A0" w:firstRow="1" w:lastRow="0" w:firstColumn="1" w:lastColumn="0" w:noHBand="0" w:noVBand="1"/>
@@ -5135,10 +5356,7 @@
               <w:ind w:left="2" w:right="-23"/>
             </w:pPr>
             <w:r>
-              <w:t xml:space="preserve">Unique identifier for each </w:t>
-            </w:r>
-            <w:r>
-              <w:t>manufacturer</w:t>
+              <w:t>Unique identifier for each manufacturer</w:t>
             </w:r>
           </w:p>
         </w:tc>
@@ -5258,6 +5476,7 @@
             </w:pPr>
             <w:proofErr w:type="spellStart"/>
             <w:r>
+              <w:lastRenderedPageBreak/>
               <w:t>ManufacturerDescription</w:t>
             </w:r>
             <w:proofErr w:type="spellEnd"/>
@@ -5410,7 +5629,6 @@
         <w:tblCellMar>
           <w:top w:w="169" w:type="dxa"/>
           <w:left w:w="118" w:type="dxa"/>
-          <w:bottom w:w="0" w:type="dxa"/>
           <w:right w:w="115" w:type="dxa"/>
         </w:tblCellMar>
         <w:tblLook w:val="04A0" w:firstRow="1" w:lastRow="0" w:firstColumn="1" w:lastColumn="0" w:noHBand="0" w:noVBand="1"/>
@@ -5984,9 +6202,6 @@
         <w:tblInd w:w="24" w:type="dxa"/>
         <w:tblCellMar>
           <w:top w:w="144" w:type="dxa"/>
-          <w:left w:w="0" w:type="dxa"/>
-          <w:bottom w:w="0" w:type="dxa"/>
-          <w:right w:w="0" w:type="dxa"/>
         </w:tblCellMar>
         <w:tblLook w:val="04A0" w:firstRow="1" w:lastRow="0" w:firstColumn="1" w:lastColumn="0" w:noHBand="0" w:noVBand="1"/>
       </w:tblPr>
@@ -6381,7 +6596,6 @@
             </w:pPr>
             <w:proofErr w:type="spellStart"/>
             <w:r>
-              <w:lastRenderedPageBreak/>
               <w:t>pending_jobs</w:t>
             </w:r>
             <w:proofErr w:type="spellEnd"/>
@@ -6651,6 +6865,7 @@
               <w:ind w:right="-23"/>
             </w:pPr>
             <w:r>
+              <w:lastRenderedPageBreak/>
               <w:t xml:space="preserve">options   </w:t>
             </w:r>
           </w:p>
@@ -7066,7 +7281,6 @@
         <w:tblCellMar>
           <w:top w:w="169" w:type="dxa"/>
           <w:left w:w="118" w:type="dxa"/>
-          <w:bottom w:w="0" w:type="dxa"/>
           <w:right w:w="115" w:type="dxa"/>
         </w:tblCellMar>
         <w:tblLook w:val="04A0" w:firstRow="1" w:lastRow="0" w:firstColumn="1" w:lastColumn="0" w:noHBand="0" w:noVBand="1"/>
@@ -7664,7 +7878,6 @@
             </w:pPr>
             <w:proofErr w:type="spellStart"/>
             <w:r>
-              <w:lastRenderedPageBreak/>
               <w:t>IsActive</w:t>
             </w:r>
             <w:proofErr w:type="spellEnd"/>
@@ -8051,6 +8264,7 @@
             </w:pPr>
             <w:proofErr w:type="spellStart"/>
             <w:r>
+              <w:lastRenderedPageBreak/>
               <w:t>NormalizedEmail</w:t>
             </w:r>
             <w:proofErr w:type="spellEnd"/>
@@ -9160,7 +9374,7 @@
       <w:r>
         <w:t xml:space="preserve">. </w:t>
       </w:r>
-      <w:hyperlink r:id="rId12" w:history="1">
+      <w:hyperlink r:id="rId13" w:history="1">
         <w:r>
           <w:rPr>
             <w:rStyle w:val="Hyperlink"/>
@@ -9179,7 +9393,7 @@
       <w:r>
         <w:t xml:space="preserve">[2] CSS3 Support. </w:t>
       </w:r>
-      <w:hyperlink r:id="rId13" w:history="1">
+      <w:hyperlink r:id="rId14" w:history="1">
         <w:r>
           <w:rPr>
             <w:rStyle w:val="Hyperlink"/>
@@ -9188,13 +9402,7 @@
         </w:r>
       </w:hyperlink>
       <w:r>
-        <w:t xml:space="preserve">, </w:t>
-      </w:r>
-      <w:r>
-        <w:t>accessed on 26.03.2026</w:t>
-      </w:r>
-      <w:r>
-        <w:t xml:space="preserve"> </w:t>
+        <w:t xml:space="preserve">, accessed on 26.03.2026 </w:t>
       </w:r>
     </w:p>
     <w:p>
@@ -9204,7 +9412,7 @@
       <w:r>
         <w:t xml:space="preserve">[3] Microsoft documentation. </w:t>
       </w:r>
-      <w:hyperlink r:id="rId14" w:history="1">
+      <w:hyperlink r:id="rId15" w:history="1">
         <w:r>
           <w:rPr>
             <w:rStyle w:val="Hyperlink"/>
@@ -9226,7 +9434,7 @@
       <w:r>
         <w:t xml:space="preserve">Solanki, K. (2024, November 15). Why .NET with SQL Server is the Ideal Choice for API Development: A Powerful Combination for Modern Applications. </w:t>
       </w:r>
-      <w:hyperlink r:id="rId15" w:history="1">
+      <w:hyperlink r:id="rId16" w:history="1">
         <w:r>
           <w:rPr>
             <w:rStyle w:val="Hyperlink"/>
@@ -9264,12 +9472,19 @@
         </w:rPr>
         <w:t>Design Inspiration</w:t>
       </w:r>
+      <w:r>
+        <w:rPr>
+          <w:b/>
+          <w:bCs/>
+        </w:rPr>
+        <w:t>0.</w:t>
+      </w:r>
     </w:p>
     <w:p>
       <w:pPr>
         <w:spacing w:line="360" w:lineRule="auto"/>
       </w:pPr>
-      <w:hyperlink r:id="rId16" w:history="1">
+      <w:hyperlink r:id="rId17" w:history="1">
         <w:r>
           <w:rPr>
             <w:rStyle w:val="Hyperlink"/>
@@ -9285,7 +9500,7 @@
       <w:pPr>
         <w:spacing w:line="360" w:lineRule="auto"/>
       </w:pPr>
-      <w:hyperlink r:id="rId17" w:history="1">
+      <w:hyperlink r:id="rId18" w:history="1">
         <w:r>
           <w:rPr>
             <w:rStyle w:val="Hyperlink"/>
@@ -9301,7 +9516,7 @@
       <w:pPr>
         <w:spacing w:line="360" w:lineRule="auto"/>
       </w:pPr>
-      <w:hyperlink r:id="rId18" w:history="1">
+      <w:hyperlink r:id="rId19" w:history="1">
         <w:r>
           <w:rPr>
             <w:rStyle w:val="Hyperlink"/>
@@ -10149,6 +10364,7 @@
   <w:style w:type="character" w:default="1" w:styleId="DefaultParagraphFont">
     <w:name w:val="Default Paragraph Font"/>
     <w:uiPriority w:val="1"/>
+    <w:semiHidden/>
     <w:unhideWhenUsed/>
   </w:style>
   <w:style w:type="table" w:default="1" w:styleId="TableNormal">

</xml_diff>